<commit_message>
Web Development with Flasj
</commit_message>
<xml_diff>
--- a/Fifteen_15_MONTH_PYTHON_CURRICULUM_DISTRIBUTION.docx
+++ b/Fifteen_15_MONTH_PYTHON_CURRICULUM_DISTRIBUTION.docx
@@ -9188,7 +9188,7 @@
         <mc:AlternateContent>
           <mc:Choice Requires="wps">
             <w:drawing>
-              <wp:anchor distT="0" distB="0" distL="114300" distR="114300" simplePos="0" relativeHeight="251743232" behindDoc="0" locked="0" layoutInCell="1" allowOverlap="1" wp14:anchorId="549EABF4" wp14:editId="663793BE">
+              <wp:anchor distT="0" distB="0" distL="114300" distR="114300" simplePos="0" relativeHeight="251743232" behindDoc="0" locked="0" layoutInCell="1" allowOverlap="1" wp14:anchorId="742325A6" wp14:editId="0368491E">
                 <wp:simplePos x="0" y="0"/>
                 <wp:positionH relativeFrom="margin">
                   <wp:posOffset>-344384</wp:posOffset>
@@ -9209,6 +9209,1568 @@
                         <a:xfrm>
                           <a:off x="0" y="0"/>
                           <a:ext cx="5625389" cy="1205345"/>
+                        </a:xfrm>
+                        <a:prstGeom prst="rect">
+                          <a:avLst/>
+                        </a:prstGeom>
+                        <a:noFill/>
+                        <a:ln w="38100">
+                          <a:solidFill>
+                            <a:srgbClr val="00FF00"/>
+                          </a:solidFill>
+                        </a:ln>
+                      </wps:spPr>
+                      <wps:txbx>
+                        <w:txbxContent>
+                          <w:p/>
+                          <w:p/>
+                          <w:p/>
+                        </w:txbxContent>
+                      </wps:txbx>
+                      <wps:bodyPr rot="0" spcFirstLastPara="0" vertOverflow="overflow" horzOverflow="overflow" vert="horz" wrap="square" lIns="91440" tIns="45720" rIns="91440" bIns="45720" numCol="1" spcCol="0" rtlCol="0" fromWordArt="0" anchor="t" anchorCtr="0" forceAA="0" compatLnSpc="1">
+                        <a:prstTxWarp prst="textNoShape">
+                          <a:avLst/>
+                        </a:prstTxWarp>
+                        <a:noAutofit/>
+                      </wps:bodyPr>
+                    </wps:wsp>
+                  </a:graphicData>
+                </a:graphic>
+                <wp14:sizeRelH relativeFrom="margin">
+                  <wp14:pctWidth>0</wp14:pctWidth>
+                </wp14:sizeRelH>
+                <wp14:sizeRelV relativeFrom="margin">
+                  <wp14:pctHeight>0</wp14:pctHeight>
+                </wp14:sizeRelV>
+              </wp:anchor>
+            </w:drawing>
+          </mc:Choice>
+          <mc:Fallback>
+            <w:pict>
+              <v:shapetype w14:anchorId="742325A6" id="_x0000_t202" coordsize="21600,21600" o:spt="202" path="m,l,21600r21600,l21600,xe">
+                <v:stroke joinstyle="miter"/>
+                <v:path gradientshapeok="t" o:connecttype="rect"/>
+              </v:shapetype>
+              <v:shape id="Text Box 19" o:spid="_x0000_s1067" type="#_x0000_t202" style="position:absolute;left:0;text-align:left;margin-left:-27.1pt;margin-top:25.55pt;width:442.95pt;height:94.9pt;z-index:251743232;visibility:visible;mso-wrap-style:square;mso-width-percent:0;mso-height-percent:0;mso-wrap-distance-left:9pt;mso-wrap-distance-top:0;mso-wrap-distance-right:9pt;mso-wrap-distance-bottom:0;mso-position-horizontal:absolute;mso-position-horizontal-relative:margin;mso-position-vertical:absolute;mso-position-vertical-relative:text;mso-width-percent:0;mso-height-percent:0;mso-width-relative:margin;mso-height-relative:margin;v-text-anchor:top" o:gfxdata="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" filled="f" strokecolor="lime" strokeweight="3pt">
+                <v:textbox>
+                  <w:txbxContent>
+                    <w:p/>
+                    <w:p/>
+                    <w:p/>
+                  </w:txbxContent>
+                </v:textbox>
+                <w10:wrap anchorx="margin"/>
+              </v:shape>
+            </w:pict>
+          </mc:Fallback>
+        </mc:AlternateContent>
+      </w:r>
+      <w:proofErr w:type="spellStart"/>
+      <w:r>
+        <w:t>os</w:t>
+      </w:r>
+      <w:proofErr w:type="spellEnd"/>
+      <w:r>
+        <w:t xml:space="preserve">, sys, </w:t>
+      </w:r>
+      <w:proofErr w:type="spellStart"/>
+      <w:r>
+        <w:t>datetime</w:t>
+      </w:r>
+      <w:proofErr w:type="spellEnd"/>
+      <w:r>
+        <w:t xml:space="preserve">, re, math, </w:t>
+      </w:r>
+      <w:proofErr w:type="spellStart"/>
+      <w:r>
+        <w:t>json</w:t>
+      </w:r>
+      <w:proofErr w:type="spellEnd"/>
+      <w:r>
+        <w:t xml:space="preserve">, csv, </w:t>
+      </w:r>
+      <w:proofErr w:type="spellStart"/>
+      <w:r>
+        <w:t>shutil</w:t>
+      </w:r>
+      <w:proofErr w:type="spellEnd"/>
+      <w:r>
+        <w:t xml:space="preserve">, </w:t>
+      </w:r>
+      <w:proofErr w:type="spellStart"/>
+      <w:r>
+        <w:t>subprocess</w:t>
+      </w:r>
+      <w:proofErr w:type="spellEnd"/>
+      <w:r>
+        <w:t>, logging</w:t>
+      </w:r>
+    </w:p>
+    <w:p>
+      <w:pPr>
+        <w:pStyle w:val="Heading3"/>
+      </w:pPr>
+      <w:r>
+        <w:rPr>
+          <w:rStyle w:val="Strong"/>
+          <w:b/>
+          <w:bCs/>
+        </w:rPr>
+        <w:t>Week 42</w:t>
+      </w:r>
+    </w:p>
+    <w:p>
+      <w:pPr>
+        <w:pStyle w:val="NormalWeb"/>
+      </w:pPr>
+      <w:r>
+        <w:rPr>
+          <w:rFonts w:ascii="Segoe UI Symbol" w:hAnsi="Segoe UI Symbol" w:cs="Segoe UI Symbol"/>
+        </w:rPr>
+        <w:t>🔸</w:t>
+      </w:r>
+      <w:r>
+        <w:t xml:space="preserve"> </w:t>
+      </w:r>
+      <w:r>
+        <w:rPr>
+          <w:rStyle w:val="Strong"/>
+        </w:rPr>
+        <w:t>21. Comprehensions</w:t>
+      </w:r>
+    </w:p>
+    <w:p>
+      <w:pPr>
+        <w:pStyle w:val="NormalWeb"/>
+        <w:numPr>
+          <w:ilvl w:val="0"/>
+          <w:numId w:val="43"/>
+        </w:numPr>
+      </w:pPr>
+      <w:r>
+        <w:t>List comprehensions</w:t>
+      </w:r>
+    </w:p>
+    <w:p>
+      <w:pPr>
+        <w:pStyle w:val="NormalWeb"/>
+        <w:numPr>
+          <w:ilvl w:val="0"/>
+          <w:numId w:val="43"/>
+        </w:numPr>
+      </w:pPr>
+      <w:r>
+        <w:t>Dictionary and set comprehensions</w:t>
+      </w:r>
+    </w:p>
+    <w:p>
+      <w:r>
+        <w:pict>
+          <v:rect id="_x0000_i1033" style="width:0;height:1.5pt" o:hralign="center" o:hrstd="t" o:hr="t" fillcolor="#a0a0a0" stroked="f"/>
+        </w:pict>
+      </w:r>
+    </w:p>
+    <w:p>
+      <w:pPr>
+        <w:pStyle w:val="Heading2"/>
+      </w:pPr>
+      <w:r>
+        <w:rPr>
+          <w:b w:val="0"/>
+          <w:bCs w:val="0"/>
+          <w:noProof/>
+        </w:rPr>
+        <mc:AlternateContent>
+          <mc:Choice Requires="wps">
+            <w:drawing>
+              <wp:anchor distT="0" distB="0" distL="114300" distR="114300" simplePos="0" relativeHeight="251745280" behindDoc="0" locked="0" layoutInCell="1" allowOverlap="1" wp14:anchorId="6C449105" wp14:editId="1D7C50B3">
+                <wp:simplePos x="0" y="0"/>
+                <wp:positionH relativeFrom="margin">
+                  <wp:posOffset>-212651</wp:posOffset>
+                </wp:positionH>
+                <wp:positionV relativeFrom="paragraph">
+                  <wp:posOffset>110505</wp:posOffset>
+                </wp:positionV>
+                <wp:extent cx="5625389" cy="1711842"/>
+                <wp:effectExtent l="19050" t="19050" r="13970" b="22225"/>
+                <wp:wrapNone/>
+                <wp:docPr id="20" name="Text Box 20"/>
+                <wp:cNvGraphicFramePr/>
+                <a:graphic xmlns:a="http://schemas.openxmlformats.org/drawingml/2006/main">
+                  <a:graphicData uri="http://schemas.microsoft.com/office/word/2010/wordprocessingShape">
+                    <wps:wsp>
+                      <wps:cNvSpPr txBox="1"/>
+                      <wps:spPr>
+                        <a:xfrm>
+                          <a:off x="0" y="0"/>
+                          <a:ext cx="5625389" cy="1711842"/>
+                        </a:xfrm>
+                        <a:prstGeom prst="rect">
+                          <a:avLst/>
+                        </a:prstGeom>
+                        <a:noFill/>
+                        <a:ln w="38100">
+                          <a:solidFill>
+                            <a:srgbClr val="00FF00"/>
+                          </a:solidFill>
+                        </a:ln>
+                      </wps:spPr>
+                      <wps:txbx>
+                        <w:txbxContent>
+                          <w:p/>
+                          <w:p/>
+                          <w:p/>
+                        </w:txbxContent>
+                      </wps:txbx>
+                      <wps:bodyPr rot="0" spcFirstLastPara="0" vertOverflow="overflow" horzOverflow="overflow" vert="horz" wrap="square" lIns="91440" tIns="45720" rIns="91440" bIns="45720" numCol="1" spcCol="0" rtlCol="0" fromWordArt="0" anchor="t" anchorCtr="0" forceAA="0" compatLnSpc="1">
+                        <a:prstTxWarp prst="textNoShape">
+                          <a:avLst/>
+                        </a:prstTxWarp>
+                        <a:noAutofit/>
+                      </wps:bodyPr>
+                    </wps:wsp>
+                  </a:graphicData>
+                </a:graphic>
+                <wp14:sizeRelH relativeFrom="margin">
+                  <wp14:pctWidth>0</wp14:pctWidth>
+                </wp14:sizeRelH>
+                <wp14:sizeRelV relativeFrom="margin">
+                  <wp14:pctHeight>0</wp14:pctHeight>
+                </wp14:sizeRelV>
+              </wp:anchor>
+            </w:drawing>
+          </mc:Choice>
+          <mc:Fallback>
+            <w:pict>
+              <v:shape w14:anchorId="6C449105" id="Text Box 20" o:spid="_x0000_s1068" type="#_x0000_t202" style="position:absolute;margin-left:-16.75pt;margin-top:8.7pt;width:442.95pt;height:134.8pt;z-index:251745280;visibility:visible;mso-wrap-style:square;mso-width-percent:0;mso-height-percent:0;mso-wrap-distance-left:9pt;mso-wrap-distance-top:0;mso-wrap-distance-right:9pt;mso-wrap-distance-bottom:0;mso-position-horizontal:absolute;mso-position-horizontal-relative:margin;mso-position-vertical:absolute;mso-position-vertical-relative:text;mso-width-percent:0;mso-height-percent:0;mso-width-relative:margin;mso-height-relative:margin;v-text-anchor:top" o:gfxdata="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" filled="f" strokecolor="lime" strokeweight="3pt">
+                <v:textbox>
+                  <w:txbxContent>
+                    <w:p/>
+                    <w:p/>
+                    <w:p/>
+                  </w:txbxContent>
+                </v:textbox>
+                <w10:wrap anchorx="margin"/>
+              </v:shape>
+            </w:pict>
+          </mc:Fallback>
+        </mc:AlternateContent>
+      </w:r>
+      <w:r>
+        <w:rPr>
+          <w:rFonts w:ascii="Segoe UI Symbol" w:hAnsi="Segoe UI Symbol" w:cs="Segoe UI Symbol"/>
+        </w:rPr>
+        <w:t>🔴</w:t>
+      </w:r>
+      <w:r>
+        <w:t xml:space="preserve"> MONTH 11 — EXPERT LEVEL (Real-World Applications)</w:t>
+      </w:r>
+    </w:p>
+    <w:p>
+      <w:pPr>
+        <w:pStyle w:val="Heading3"/>
+      </w:pPr>
+      <w:r>
+        <w:rPr>
+          <w:rStyle w:val="Strong"/>
+          <w:b/>
+          <w:bCs/>
+        </w:rPr>
+        <w:t>Week 43</w:t>
+      </w:r>
+    </w:p>
+    <w:p>
+      <w:pPr>
+        <w:pStyle w:val="NormalWeb"/>
+      </w:pPr>
+      <w:r>
+        <w:rPr>
+          <w:rFonts w:ascii="Segoe UI Symbol" w:hAnsi="Segoe UI Symbol" w:cs="Segoe UI Symbol"/>
+        </w:rPr>
+        <w:t>🔸</w:t>
+      </w:r>
+      <w:r>
+        <w:t xml:space="preserve"> </w:t>
+      </w:r>
+      <w:r>
+        <w:rPr>
+          <w:rStyle w:val="Strong"/>
+        </w:rPr>
+        <w:t>21. Comprehensions</w:t>
+      </w:r>
+    </w:p>
+    <w:p>
+      <w:pPr>
+        <w:pStyle w:val="NormalWeb"/>
+        <w:numPr>
+          <w:ilvl w:val="0"/>
+          <w:numId w:val="44"/>
+        </w:numPr>
+      </w:pPr>
+      <w:r>
+        <w:rPr>
+          <w:b/>
+          <w:bCs/>
+          <w:noProof/>
+        </w:rPr>
+        <mc:AlternateContent>
+          <mc:Choice Requires="wps">
+            <w:drawing>
+              <wp:anchor distT="0" distB="0" distL="114300" distR="114300" simplePos="0" relativeHeight="251747328" behindDoc="0" locked="0" layoutInCell="1" allowOverlap="1" wp14:anchorId="0DCE58BD" wp14:editId="402F064E">
+                <wp:simplePos x="0" y="0"/>
+                <wp:positionH relativeFrom="margin">
+                  <wp:posOffset>-180753</wp:posOffset>
+                </wp:positionH>
+                <wp:positionV relativeFrom="paragraph">
+                  <wp:posOffset>331338</wp:posOffset>
+                </wp:positionV>
+                <wp:extent cx="5625389" cy="1180214"/>
+                <wp:effectExtent l="19050" t="19050" r="13970" b="20320"/>
+                <wp:wrapNone/>
+                <wp:docPr id="21" name="Text Box 21"/>
+                <wp:cNvGraphicFramePr/>
+                <a:graphic xmlns:a="http://schemas.openxmlformats.org/drawingml/2006/main">
+                  <a:graphicData uri="http://schemas.microsoft.com/office/word/2010/wordprocessingShape">
+                    <wps:wsp>
+                      <wps:cNvSpPr txBox="1"/>
+                      <wps:spPr>
+                        <a:xfrm>
+                          <a:off x="0" y="0"/>
+                          <a:ext cx="5625389" cy="1180214"/>
+                        </a:xfrm>
+                        <a:prstGeom prst="rect">
+                          <a:avLst/>
+                        </a:prstGeom>
+                        <a:noFill/>
+                        <a:ln w="38100">
+                          <a:solidFill>
+                            <a:srgbClr val="00FF00"/>
+                          </a:solidFill>
+                        </a:ln>
+                      </wps:spPr>
+                      <wps:txbx>
+                        <w:txbxContent>
+                          <w:p/>
+                          <w:p/>
+                          <w:p/>
+                        </w:txbxContent>
+                      </wps:txbx>
+                      <wps:bodyPr rot="0" spcFirstLastPara="0" vertOverflow="overflow" horzOverflow="overflow" vert="horz" wrap="square" lIns="91440" tIns="45720" rIns="91440" bIns="45720" numCol="1" spcCol="0" rtlCol="0" fromWordArt="0" anchor="t" anchorCtr="0" forceAA="0" compatLnSpc="1">
+                        <a:prstTxWarp prst="textNoShape">
+                          <a:avLst/>
+                        </a:prstTxWarp>
+                        <a:noAutofit/>
+                      </wps:bodyPr>
+                    </wps:wsp>
+                  </a:graphicData>
+                </a:graphic>
+                <wp14:sizeRelH relativeFrom="margin">
+                  <wp14:pctWidth>0</wp14:pctWidth>
+                </wp14:sizeRelH>
+                <wp14:sizeRelV relativeFrom="margin">
+                  <wp14:pctHeight>0</wp14:pctHeight>
+                </wp14:sizeRelV>
+              </wp:anchor>
+            </w:drawing>
+          </mc:Choice>
+          <mc:Fallback>
+            <w:pict>
+              <v:shape w14:anchorId="0DCE58BD" id="Text Box 21" o:spid="_x0000_s1069" type="#_x0000_t202" style="position:absolute;left:0;text-align:left;margin-left:-14.25pt;margin-top:26.1pt;width:442.95pt;height:92.95pt;z-index:251747328;visibility:visible;mso-wrap-style:square;mso-width-percent:0;mso-height-percent:0;mso-wrap-distance-left:9pt;mso-wrap-distance-top:0;mso-wrap-distance-right:9pt;mso-wrap-distance-bottom:0;mso-position-horizontal:absolute;mso-position-horizontal-relative:margin;mso-position-vertical:absolute;mso-position-vertical-relative:text;mso-width-percent:0;mso-height-percent:0;mso-width-relative:margin;mso-height-relative:margin;v-text-anchor:top" o:gfxdata="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" filled="f" strokecolor="lime" strokeweight="3pt">
+                <v:textbox>
+                  <w:txbxContent>
+                    <w:p/>
+                    <w:p/>
+                    <w:p/>
+                  </w:txbxContent>
+                </v:textbox>
+                <w10:wrap anchorx="margin"/>
+              </v:shape>
+            </w:pict>
+          </mc:Fallback>
+        </mc:AlternateContent>
+      </w:r>
+      <w:r>
+        <w:t>Nested comprehensions</w:t>
+      </w:r>
+    </w:p>
+    <w:p>
+      <w:pPr>
+        <w:pStyle w:val="Heading3"/>
+      </w:pPr>
+      <w:r>
+        <w:rPr>
+          <w:rStyle w:val="Strong"/>
+          <w:b/>
+          <w:bCs/>
+        </w:rPr>
+        <w:t>Week 44</w:t>
+      </w:r>
+    </w:p>
+    <w:p>
+      <w:pPr>
+        <w:pStyle w:val="NormalWeb"/>
+      </w:pPr>
+      <w:r>
+        <w:rPr>
+          <w:rFonts w:ascii="Segoe UI Symbol" w:hAnsi="Segoe UI Symbol" w:cs="Segoe UI Symbol"/>
+        </w:rPr>
+        <w:t>🔸</w:t>
+      </w:r>
+      <w:r>
+        <w:t xml:space="preserve"> </w:t>
+      </w:r>
+      <w:r>
+        <w:rPr>
+          <w:rStyle w:val="Strong"/>
+        </w:rPr>
+        <w:t>22. Regular Expressions (re)</w:t>
+      </w:r>
+    </w:p>
+    <w:p>
+      <w:pPr>
+        <w:pStyle w:val="NormalWeb"/>
+        <w:numPr>
+          <w:ilvl w:val="0"/>
+          <w:numId w:val="45"/>
+        </w:numPr>
+      </w:pPr>
+      <w:proofErr w:type="gramStart"/>
+      <w:r>
+        <w:t>match(</w:t>
+      </w:r>
+      <w:proofErr w:type="gramEnd"/>
+      <w:r>
+        <w:t xml:space="preserve">), search(), </w:t>
+      </w:r>
+      <w:proofErr w:type="spellStart"/>
+      <w:r>
+        <w:t>findall</w:t>
+      </w:r>
+      <w:proofErr w:type="spellEnd"/>
+      <w:r>
+        <w:t>(), sub()</w:t>
+      </w:r>
+    </w:p>
+    <w:p>
+      <w:pPr>
+        <w:pStyle w:val="NormalWeb"/>
+        <w:numPr>
+          <w:ilvl w:val="0"/>
+          <w:numId w:val="45"/>
+        </w:numPr>
+      </w:pPr>
+      <w:r>
+        <w:rPr>
+          <w:b/>
+          <w:bCs/>
+          <w:noProof/>
+        </w:rPr>
+        <mc:AlternateContent>
+          <mc:Choice Requires="wps">
+            <w:drawing>
+              <wp:anchor distT="0" distB="0" distL="114300" distR="114300" simplePos="0" relativeHeight="251749376" behindDoc="0" locked="0" layoutInCell="1" allowOverlap="1" wp14:anchorId="1A90EDD3" wp14:editId="450088A6">
+                <wp:simplePos x="0" y="0"/>
+                <wp:positionH relativeFrom="margin">
+                  <wp:posOffset>-127591</wp:posOffset>
+                </wp:positionH>
+                <wp:positionV relativeFrom="paragraph">
+                  <wp:posOffset>333907</wp:posOffset>
+                </wp:positionV>
+                <wp:extent cx="5625389" cy="988828"/>
+                <wp:effectExtent l="19050" t="19050" r="13970" b="20955"/>
+                <wp:wrapNone/>
+                <wp:docPr id="22" name="Text Box 22"/>
+                <wp:cNvGraphicFramePr/>
+                <a:graphic xmlns:a="http://schemas.openxmlformats.org/drawingml/2006/main">
+                  <a:graphicData uri="http://schemas.microsoft.com/office/word/2010/wordprocessingShape">
+                    <wps:wsp>
+                      <wps:cNvSpPr txBox="1"/>
+                      <wps:spPr>
+                        <a:xfrm>
+                          <a:off x="0" y="0"/>
+                          <a:ext cx="5625389" cy="988828"/>
+                        </a:xfrm>
+                        <a:prstGeom prst="rect">
+                          <a:avLst/>
+                        </a:prstGeom>
+                        <a:noFill/>
+                        <a:ln w="38100">
+                          <a:solidFill>
+                            <a:srgbClr val="00FF00"/>
+                          </a:solidFill>
+                        </a:ln>
+                      </wps:spPr>
+                      <wps:txbx>
+                        <w:txbxContent>
+                          <w:p/>
+                          <w:p/>
+                          <w:p/>
+                        </w:txbxContent>
+                      </wps:txbx>
+                      <wps:bodyPr rot="0" spcFirstLastPara="0" vertOverflow="overflow" horzOverflow="overflow" vert="horz" wrap="square" lIns="91440" tIns="45720" rIns="91440" bIns="45720" numCol="1" spcCol="0" rtlCol="0" fromWordArt="0" anchor="t" anchorCtr="0" forceAA="0" compatLnSpc="1">
+                        <a:prstTxWarp prst="textNoShape">
+                          <a:avLst/>
+                        </a:prstTxWarp>
+                        <a:noAutofit/>
+                      </wps:bodyPr>
+                    </wps:wsp>
+                  </a:graphicData>
+                </a:graphic>
+                <wp14:sizeRelH relativeFrom="margin">
+                  <wp14:pctWidth>0</wp14:pctWidth>
+                </wp14:sizeRelH>
+                <wp14:sizeRelV relativeFrom="margin">
+                  <wp14:pctHeight>0</wp14:pctHeight>
+                </wp14:sizeRelV>
+              </wp:anchor>
+            </w:drawing>
+          </mc:Choice>
+          <mc:Fallback>
+            <w:pict>
+              <v:shape w14:anchorId="1A90EDD3" id="Text Box 22" o:spid="_x0000_s1070" type="#_x0000_t202" style="position:absolute;left:0;text-align:left;margin-left:-10.05pt;margin-top:26.3pt;width:442.95pt;height:77.85pt;z-index:251749376;visibility:visible;mso-wrap-style:square;mso-width-percent:0;mso-height-percent:0;mso-wrap-distance-left:9pt;mso-wrap-distance-top:0;mso-wrap-distance-right:9pt;mso-wrap-distance-bottom:0;mso-position-horizontal:absolute;mso-position-horizontal-relative:margin;mso-position-vertical:absolute;mso-position-vertical-relative:text;mso-width-percent:0;mso-height-percent:0;mso-width-relative:margin;mso-height-relative:margin;v-text-anchor:top" o:gfxdata="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" filled="f" strokecolor="lime" strokeweight="3pt">
+                <v:textbox>
+                  <w:txbxContent>
+                    <w:p/>
+                    <w:p/>
+                    <w:p/>
+                  </w:txbxContent>
+                </v:textbox>
+                <w10:wrap anchorx="margin"/>
+              </v:shape>
+            </w:pict>
+          </mc:Fallback>
+        </mc:AlternateContent>
+      </w:r>
+      <w:r>
+        <w:t>Meta-characters and groups</w:t>
+      </w:r>
+    </w:p>
+    <w:p>
+      <w:pPr>
+        <w:pStyle w:val="Heading3"/>
+      </w:pPr>
+      <w:r>
+        <w:rPr>
+          <w:rStyle w:val="Strong"/>
+          <w:b/>
+          <w:bCs/>
+        </w:rPr>
+        <w:t>Week 45</w:t>
+      </w:r>
+    </w:p>
+    <w:p>
+      <w:pPr>
+        <w:pStyle w:val="NormalWeb"/>
+      </w:pPr>
+      <w:r>
+        <w:rPr>
+          <w:rFonts w:ascii="Segoe UI Symbol" w:hAnsi="Segoe UI Symbol" w:cs="Segoe UI Symbol"/>
+        </w:rPr>
+        <w:t>🔸</w:t>
+      </w:r>
+      <w:r>
+        <w:t xml:space="preserve"> </w:t>
+      </w:r>
+      <w:r>
+        <w:rPr>
+          <w:rStyle w:val="Strong"/>
+        </w:rPr>
+        <w:t>22. Regular Expressions (re)</w:t>
+      </w:r>
+    </w:p>
+    <w:p>
+      <w:pPr>
+        <w:pStyle w:val="NormalWeb"/>
+        <w:numPr>
+          <w:ilvl w:val="0"/>
+          <w:numId w:val="46"/>
+        </w:numPr>
+      </w:pPr>
+      <w:r>
+        <w:rPr>
+          <w:b/>
+          <w:bCs/>
+          <w:noProof/>
+        </w:rPr>
+        <mc:AlternateContent>
+          <mc:Choice Requires="wps">
+            <w:drawing>
+              <wp:anchor distT="0" distB="0" distL="114300" distR="114300" simplePos="0" relativeHeight="251751424" behindDoc="0" locked="0" layoutInCell="1" allowOverlap="1" wp14:anchorId="25683E17" wp14:editId="2B22CD53">
+                <wp:simplePos x="0" y="0"/>
+                <wp:positionH relativeFrom="margin">
+                  <wp:posOffset>-127591</wp:posOffset>
+                </wp:positionH>
+                <wp:positionV relativeFrom="paragraph">
+                  <wp:posOffset>299085</wp:posOffset>
+                </wp:positionV>
+                <wp:extent cx="5625389" cy="701749"/>
+                <wp:effectExtent l="19050" t="19050" r="13970" b="22225"/>
+                <wp:wrapNone/>
+                <wp:docPr id="23" name="Text Box 23"/>
+                <wp:cNvGraphicFramePr/>
+                <a:graphic xmlns:a="http://schemas.openxmlformats.org/drawingml/2006/main">
+                  <a:graphicData uri="http://schemas.microsoft.com/office/word/2010/wordprocessingShape">
+                    <wps:wsp>
+                      <wps:cNvSpPr txBox="1"/>
+                      <wps:spPr>
+                        <a:xfrm>
+                          <a:off x="0" y="0"/>
+                          <a:ext cx="5625389" cy="701749"/>
+                        </a:xfrm>
+                        <a:prstGeom prst="rect">
+                          <a:avLst/>
+                        </a:prstGeom>
+                        <a:noFill/>
+                        <a:ln w="38100">
+                          <a:solidFill>
+                            <a:srgbClr val="00FF00"/>
+                          </a:solidFill>
+                        </a:ln>
+                      </wps:spPr>
+                      <wps:txbx>
+                        <w:txbxContent>
+                          <w:p/>
+                          <w:p/>
+                          <w:p/>
+                        </w:txbxContent>
+                      </wps:txbx>
+                      <wps:bodyPr rot="0" spcFirstLastPara="0" vertOverflow="overflow" horzOverflow="overflow" vert="horz" wrap="square" lIns="91440" tIns="45720" rIns="91440" bIns="45720" numCol="1" spcCol="0" rtlCol="0" fromWordArt="0" anchor="t" anchorCtr="0" forceAA="0" compatLnSpc="1">
+                        <a:prstTxWarp prst="textNoShape">
+                          <a:avLst/>
+                        </a:prstTxWarp>
+                        <a:noAutofit/>
+                      </wps:bodyPr>
+                    </wps:wsp>
+                  </a:graphicData>
+                </a:graphic>
+                <wp14:sizeRelH relativeFrom="margin">
+                  <wp14:pctWidth>0</wp14:pctWidth>
+                </wp14:sizeRelH>
+                <wp14:sizeRelV relativeFrom="margin">
+                  <wp14:pctHeight>0</wp14:pctHeight>
+                </wp14:sizeRelV>
+              </wp:anchor>
+            </w:drawing>
+          </mc:Choice>
+          <mc:Fallback>
+            <w:pict>
+              <v:shape w14:anchorId="25683E17" id="Text Box 23" o:spid="_x0000_s1071" type="#_x0000_t202" style="position:absolute;left:0;text-align:left;margin-left:-10.05pt;margin-top:23.55pt;width:442.95pt;height:55.25pt;z-index:251751424;visibility:visible;mso-wrap-style:square;mso-width-percent:0;mso-height-percent:0;mso-wrap-distance-left:9pt;mso-wrap-distance-top:0;mso-wrap-distance-right:9pt;mso-wrap-distance-bottom:0;mso-position-horizontal:absolute;mso-position-horizontal-relative:margin;mso-position-vertical:absolute;mso-position-vertical-relative:text;mso-width-percent:0;mso-height-percent:0;mso-width-relative:margin;mso-height-relative:margin;v-text-anchor:top" o:gfxdata="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" filled="f" strokecolor="lime" strokeweight="3pt">
+                <v:textbox>
+                  <w:txbxContent>
+                    <w:p/>
+                    <w:p/>
+                    <w:p/>
+                  </w:txbxContent>
+                </v:textbox>
+                <w10:wrap anchorx="margin"/>
+              </v:shape>
+            </w:pict>
+          </mc:Fallback>
+        </mc:AlternateContent>
+      </w:r>
+      <w:r>
+        <w:t>Raw strings for regex</w:t>
+      </w:r>
+    </w:p>
+    <w:p>
+      <w:pPr>
+        <w:pStyle w:val="Heading3"/>
+      </w:pPr>
+      <w:r>
+        <w:rPr>
+          <w:rStyle w:val="Strong"/>
+          <w:b/>
+          <w:bCs/>
+        </w:rPr>
+        <w:t>Week 46</w:t>
+      </w:r>
+    </w:p>
+    <w:p>
+      <w:pPr>
+        <w:pStyle w:val="NormalWeb"/>
+      </w:pPr>
+      <w:r>
+        <w:rPr>
+          <w:rFonts w:ascii="Segoe UI Symbol" w:hAnsi="Segoe UI Symbol" w:cs="Segoe UI Symbol"/>
+        </w:rPr>
+        <w:t>🔸</w:t>
+      </w:r>
+      <w:r>
+        <w:t xml:space="preserve"> </w:t>
+      </w:r>
+      <w:r>
+        <w:rPr>
+          <w:rStyle w:val="Strong"/>
+        </w:rPr>
+        <w:t>23. Functional Programming</w:t>
+      </w:r>
+    </w:p>
+    <w:p>
+      <w:pPr>
+        <w:pStyle w:val="NormalWeb"/>
+        <w:numPr>
+          <w:ilvl w:val="0"/>
+          <w:numId w:val="47"/>
+        </w:numPr>
+      </w:pPr>
+      <w:r>
+        <w:rPr>
+          <w:b/>
+          <w:bCs/>
+          <w:noProof/>
+        </w:rPr>
+        <w:lastRenderedPageBreak/>
+        <mc:AlternateContent>
+          <mc:Choice Requires="wps">
+            <w:drawing>
+              <wp:anchor distT="0" distB="0" distL="114300" distR="114300" simplePos="0" relativeHeight="251753472" behindDoc="0" locked="0" layoutInCell="1" allowOverlap="1" wp14:anchorId="4E9976BC" wp14:editId="706CFA16">
+                <wp:simplePos x="0" y="0"/>
+                <wp:positionH relativeFrom="margin">
+                  <wp:align>right</wp:align>
+                </wp:positionH>
+                <wp:positionV relativeFrom="paragraph">
+                  <wp:posOffset>-262270</wp:posOffset>
+                </wp:positionV>
+                <wp:extent cx="5625389" cy="701749"/>
+                <wp:effectExtent l="19050" t="19050" r="13970" b="22225"/>
+                <wp:wrapNone/>
+                <wp:docPr id="24" name="Text Box 24"/>
+                <wp:cNvGraphicFramePr/>
+                <a:graphic xmlns:a="http://schemas.openxmlformats.org/drawingml/2006/main">
+                  <a:graphicData uri="http://schemas.microsoft.com/office/word/2010/wordprocessingShape">
+                    <wps:wsp>
+                      <wps:cNvSpPr txBox="1"/>
+                      <wps:spPr>
+                        <a:xfrm>
+                          <a:off x="0" y="0"/>
+                          <a:ext cx="5625389" cy="701749"/>
+                        </a:xfrm>
+                        <a:prstGeom prst="rect">
+                          <a:avLst/>
+                        </a:prstGeom>
+                        <a:noFill/>
+                        <a:ln w="38100">
+                          <a:solidFill>
+                            <a:srgbClr val="00FF00"/>
+                          </a:solidFill>
+                        </a:ln>
+                      </wps:spPr>
+                      <wps:txbx>
+                        <w:txbxContent>
+                          <w:p/>
+                          <w:p/>
+                          <w:p/>
+                        </w:txbxContent>
+                      </wps:txbx>
+                      <wps:bodyPr rot="0" spcFirstLastPara="0" vertOverflow="overflow" horzOverflow="overflow" vert="horz" wrap="square" lIns="91440" tIns="45720" rIns="91440" bIns="45720" numCol="1" spcCol="0" rtlCol="0" fromWordArt="0" anchor="t" anchorCtr="0" forceAA="0" compatLnSpc="1">
+                        <a:prstTxWarp prst="textNoShape">
+                          <a:avLst/>
+                        </a:prstTxWarp>
+                        <a:noAutofit/>
+                      </wps:bodyPr>
+                    </wps:wsp>
+                  </a:graphicData>
+                </a:graphic>
+                <wp14:sizeRelH relativeFrom="margin">
+                  <wp14:pctWidth>0</wp14:pctWidth>
+                </wp14:sizeRelH>
+                <wp14:sizeRelV relativeFrom="margin">
+                  <wp14:pctHeight>0</wp14:pctHeight>
+                </wp14:sizeRelV>
+              </wp:anchor>
+            </w:drawing>
+          </mc:Choice>
+          <mc:Fallback>
+            <w:pict>
+              <v:shape w14:anchorId="4E9976BC" id="Text Box 24" o:spid="_x0000_s1072" type="#_x0000_t202" style="position:absolute;left:0;text-align:left;margin-left:391.75pt;margin-top:-20.65pt;width:442.95pt;height:55.25pt;z-index:251753472;visibility:visible;mso-wrap-style:square;mso-width-percent:0;mso-height-percent:0;mso-wrap-distance-left:9pt;mso-wrap-distance-top:0;mso-wrap-distance-right:9pt;mso-wrap-distance-bottom:0;mso-position-horizontal:right;mso-position-horizontal-relative:margin;mso-position-vertical:absolute;mso-position-vertical-relative:text;mso-width-percent:0;mso-height-percent:0;mso-width-relative:margin;mso-height-relative:margin;v-text-anchor:top" o:gfxdata="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" filled="f" strokecolor="lime" strokeweight="3pt">
+                <v:textbox>
+                  <w:txbxContent>
+                    <w:p/>
+                    <w:p/>
+                    <w:p/>
+                  </w:txbxContent>
+                </v:textbox>
+                <w10:wrap anchorx="margin"/>
+              </v:shape>
+            </w:pict>
+          </mc:Fallback>
+        </mc:AlternateContent>
+      </w:r>
+      <w:proofErr w:type="gramStart"/>
+      <w:r>
+        <w:t>map(</w:t>
+      </w:r>
+      <w:proofErr w:type="gramEnd"/>
+      <w:r>
+        <w:t>), filter(), reduce()</w:t>
+      </w:r>
+    </w:p>
+    <w:p>
+      <w:pPr>
+        <w:pStyle w:val="NormalWeb"/>
+        <w:numPr>
+          <w:ilvl w:val="0"/>
+          <w:numId w:val="47"/>
+        </w:numPr>
+      </w:pPr>
+      <w:r>
+        <w:t>Higher-order functions</w:t>
+      </w:r>
+    </w:p>
+    <w:p>
+      <w:r>
+        <w:pict>
+          <v:rect id="_x0000_i1034" style="width:0;height:1.5pt" o:hralign="center" o:hrstd="t" o:hr="t" fillcolor="#a0a0a0" stroked="f"/>
+        </w:pict>
+      </w:r>
+    </w:p>
+    <w:p>
+      <w:pPr>
+        <w:pStyle w:val="Heading2"/>
+      </w:pPr>
+      <w:r>
+        <w:rPr>
+          <w:b w:val="0"/>
+          <w:bCs w:val="0"/>
+          <w:noProof/>
+        </w:rPr>
+        <mc:AlternateContent>
+          <mc:Choice Requires="wps">
+            <w:drawing>
+              <wp:anchor distT="0" distB="0" distL="114300" distR="114300" simplePos="0" relativeHeight="251755520" behindDoc="0" locked="0" layoutInCell="1" allowOverlap="1" wp14:anchorId="1FC31E7F" wp14:editId="1B75B565">
+                <wp:simplePos x="0" y="0"/>
+                <wp:positionH relativeFrom="margin">
+                  <wp:posOffset>-106326</wp:posOffset>
+                </wp:positionH>
+                <wp:positionV relativeFrom="paragraph">
+                  <wp:posOffset>110963</wp:posOffset>
+                </wp:positionV>
+                <wp:extent cx="5625389" cy="1701209"/>
+                <wp:effectExtent l="19050" t="19050" r="13970" b="13335"/>
+                <wp:wrapNone/>
+                <wp:docPr id="25" name="Text Box 25"/>
+                <wp:cNvGraphicFramePr/>
+                <a:graphic xmlns:a="http://schemas.openxmlformats.org/drawingml/2006/main">
+                  <a:graphicData uri="http://schemas.microsoft.com/office/word/2010/wordprocessingShape">
+                    <wps:wsp>
+                      <wps:cNvSpPr txBox="1"/>
+                      <wps:spPr>
+                        <a:xfrm>
+                          <a:off x="0" y="0"/>
+                          <a:ext cx="5625389" cy="1701209"/>
+                        </a:xfrm>
+                        <a:prstGeom prst="rect">
+                          <a:avLst/>
+                        </a:prstGeom>
+                        <a:noFill/>
+                        <a:ln w="38100">
+                          <a:solidFill>
+                            <a:srgbClr val="00FF00"/>
+                          </a:solidFill>
+                        </a:ln>
+                      </wps:spPr>
+                      <wps:txbx>
+                        <w:txbxContent>
+                          <w:p/>
+                          <w:p/>
+                          <w:p/>
+                        </w:txbxContent>
+                      </wps:txbx>
+                      <wps:bodyPr rot="0" spcFirstLastPara="0" vertOverflow="overflow" horzOverflow="overflow" vert="horz" wrap="square" lIns="91440" tIns="45720" rIns="91440" bIns="45720" numCol="1" spcCol="0" rtlCol="0" fromWordArt="0" anchor="t" anchorCtr="0" forceAA="0" compatLnSpc="1">
+                        <a:prstTxWarp prst="textNoShape">
+                          <a:avLst/>
+                        </a:prstTxWarp>
+                        <a:noAutofit/>
+                      </wps:bodyPr>
+                    </wps:wsp>
+                  </a:graphicData>
+                </a:graphic>
+                <wp14:sizeRelH relativeFrom="margin">
+                  <wp14:pctWidth>0</wp14:pctWidth>
+                </wp14:sizeRelH>
+                <wp14:sizeRelV relativeFrom="margin">
+                  <wp14:pctHeight>0</wp14:pctHeight>
+                </wp14:sizeRelV>
+              </wp:anchor>
+            </w:drawing>
+          </mc:Choice>
+          <mc:Fallback>
+            <w:pict>
+              <v:shape w14:anchorId="1FC31E7F" id="Text Box 25" o:spid="_x0000_s1073" type="#_x0000_t202" style="position:absolute;margin-left:-8.35pt;margin-top:8.75pt;width:442.95pt;height:133.95pt;z-index:251755520;visibility:visible;mso-wrap-style:square;mso-width-percent:0;mso-height-percent:0;mso-wrap-distance-left:9pt;mso-wrap-distance-top:0;mso-wrap-distance-right:9pt;mso-wrap-distance-bottom:0;mso-position-horizontal:absolute;mso-position-horizontal-relative:margin;mso-position-vertical:absolute;mso-position-vertical-relative:text;mso-width-percent:0;mso-height-percent:0;mso-width-relative:margin;mso-height-relative:margin;v-text-anchor:top" o:gfxdata="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" filled="f" strokecolor="lime" strokeweight="3pt">
+                <v:textbox>
+                  <w:txbxContent>
+                    <w:p/>
+                    <w:p/>
+                    <w:p/>
+                  </w:txbxContent>
+                </v:textbox>
+                <w10:wrap anchorx="margin"/>
+              </v:shape>
+            </w:pict>
+          </mc:Fallback>
+        </mc:AlternateContent>
+      </w:r>
+      <w:r>
+        <w:rPr>
+          <w:rFonts w:ascii="Segoe UI Symbol" w:hAnsi="Segoe UI Symbol" w:cs="Segoe UI Symbol"/>
+        </w:rPr>
+        <w:t>🔴</w:t>
+      </w:r>
+      <w:r>
+        <w:t xml:space="preserve"> MONTH 12 — EXPERT LEVEL (Real-World Applications)</w:t>
+      </w:r>
+    </w:p>
+    <w:p>
+      <w:pPr>
+        <w:pStyle w:val="Heading3"/>
+      </w:pPr>
+      <w:r>
+        <w:rPr>
+          <w:rStyle w:val="Strong"/>
+          <w:b/>
+          <w:bCs/>
+        </w:rPr>
+        <w:t>Week 47</w:t>
+      </w:r>
+    </w:p>
+    <w:p>
+      <w:pPr>
+        <w:pStyle w:val="NormalWeb"/>
+      </w:pPr>
+      <w:r>
+        <w:rPr>
+          <w:rFonts w:ascii="Segoe UI Symbol" w:hAnsi="Segoe UI Symbol" w:cs="Segoe UI Symbol"/>
+        </w:rPr>
+        <w:t>🔸</w:t>
+      </w:r>
+      <w:r>
+        <w:t xml:space="preserve"> </w:t>
+      </w:r>
+      <w:r>
+        <w:rPr>
+          <w:rStyle w:val="Strong"/>
+        </w:rPr>
+        <w:t>23. Functional Programming</w:t>
+      </w:r>
+    </w:p>
+    <w:p>
+      <w:pPr>
+        <w:pStyle w:val="NormalWeb"/>
+        <w:numPr>
+          <w:ilvl w:val="0"/>
+          <w:numId w:val="48"/>
+        </w:numPr>
+      </w:pPr>
+      <w:r>
+        <w:rPr>
+          <w:b/>
+          <w:bCs/>
+          <w:noProof/>
+        </w:rPr>
+        <mc:AlternateContent>
+          <mc:Choice Requires="wps">
+            <w:drawing>
+              <wp:anchor distT="0" distB="0" distL="114300" distR="114300" simplePos="0" relativeHeight="251757568" behindDoc="0" locked="0" layoutInCell="1" allowOverlap="1" wp14:anchorId="4FE0E971" wp14:editId="0268667A">
+                <wp:simplePos x="0" y="0"/>
+                <wp:positionH relativeFrom="margin">
+                  <wp:posOffset>-106326</wp:posOffset>
+                </wp:positionH>
+                <wp:positionV relativeFrom="paragraph">
+                  <wp:posOffset>321162</wp:posOffset>
+                </wp:positionV>
+                <wp:extent cx="5625389" cy="1190847"/>
+                <wp:effectExtent l="19050" t="19050" r="13970" b="28575"/>
+                <wp:wrapNone/>
+                <wp:docPr id="26" name="Text Box 26"/>
+                <wp:cNvGraphicFramePr/>
+                <a:graphic xmlns:a="http://schemas.openxmlformats.org/drawingml/2006/main">
+                  <a:graphicData uri="http://schemas.microsoft.com/office/word/2010/wordprocessingShape">
+                    <wps:wsp>
+                      <wps:cNvSpPr txBox="1"/>
+                      <wps:spPr>
+                        <a:xfrm>
+                          <a:off x="0" y="0"/>
+                          <a:ext cx="5625389" cy="1190847"/>
+                        </a:xfrm>
+                        <a:prstGeom prst="rect">
+                          <a:avLst/>
+                        </a:prstGeom>
+                        <a:noFill/>
+                        <a:ln w="38100">
+                          <a:solidFill>
+                            <a:srgbClr val="00FF00"/>
+                          </a:solidFill>
+                        </a:ln>
+                      </wps:spPr>
+                      <wps:txbx>
+                        <w:txbxContent>
+                          <w:p/>
+                          <w:p/>
+                          <w:p/>
+                        </w:txbxContent>
+                      </wps:txbx>
+                      <wps:bodyPr rot="0" spcFirstLastPara="0" vertOverflow="overflow" horzOverflow="overflow" vert="horz" wrap="square" lIns="91440" tIns="45720" rIns="91440" bIns="45720" numCol="1" spcCol="0" rtlCol="0" fromWordArt="0" anchor="t" anchorCtr="0" forceAA="0" compatLnSpc="1">
+                        <a:prstTxWarp prst="textNoShape">
+                          <a:avLst/>
+                        </a:prstTxWarp>
+                        <a:noAutofit/>
+                      </wps:bodyPr>
+                    </wps:wsp>
+                  </a:graphicData>
+                </a:graphic>
+                <wp14:sizeRelH relativeFrom="margin">
+                  <wp14:pctWidth>0</wp14:pctWidth>
+                </wp14:sizeRelH>
+                <wp14:sizeRelV relativeFrom="margin">
+                  <wp14:pctHeight>0</wp14:pctHeight>
+                </wp14:sizeRelV>
+              </wp:anchor>
+            </w:drawing>
+          </mc:Choice>
+          <mc:Fallback>
+            <w:pict>
+              <v:shape w14:anchorId="4FE0E971" id="Text Box 26" o:spid="_x0000_s1074" type="#_x0000_t202" style="position:absolute;left:0;text-align:left;margin-left:-8.35pt;margin-top:25.3pt;width:442.95pt;height:93.75pt;z-index:251757568;visibility:visible;mso-wrap-style:square;mso-width-percent:0;mso-height-percent:0;mso-wrap-distance-left:9pt;mso-wrap-distance-top:0;mso-wrap-distance-right:9pt;mso-wrap-distance-bottom:0;mso-position-horizontal:absolute;mso-position-horizontal-relative:margin;mso-position-vertical:absolute;mso-position-vertical-relative:text;mso-width-percent:0;mso-height-percent:0;mso-width-relative:margin;mso-height-relative:margin;v-text-anchor:top" o:gfxdata="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" filled="f" strokecolor="lime" strokeweight="3pt">
+                <v:textbox>
+                  <w:txbxContent>
+                    <w:p/>
+                    <w:p/>
+                    <w:p/>
+                  </w:txbxContent>
+                </v:textbox>
+                <w10:wrap anchorx="margin"/>
+              </v:shape>
+            </w:pict>
+          </mc:Fallback>
+        </mc:AlternateContent>
+      </w:r>
+      <w:r>
+        <w:t>Closures</w:t>
+      </w:r>
+    </w:p>
+    <w:p>
+      <w:pPr>
+        <w:pStyle w:val="Heading3"/>
+      </w:pPr>
+      <w:r>
+        <w:rPr>
+          <w:rStyle w:val="Strong"/>
+          <w:b/>
+          <w:bCs/>
+        </w:rPr>
+        <w:t>Week 48</w:t>
+      </w:r>
+    </w:p>
+    <w:p>
+      <w:pPr>
+        <w:pStyle w:val="NormalWeb"/>
+      </w:pPr>
+      <w:r>
+        <w:rPr>
+          <w:rFonts w:ascii="Segoe UI Symbol" w:hAnsi="Segoe UI Symbol" w:cs="Segoe UI Symbol"/>
+        </w:rPr>
+        <w:t>🔸</w:t>
+      </w:r>
+      <w:r>
+        <w:t xml:space="preserve"> </w:t>
+      </w:r>
+      <w:r>
+        <w:rPr>
+          <w:rStyle w:val="Strong"/>
+        </w:rPr>
+        <w:t>24. Working with APIs</w:t>
+      </w:r>
+    </w:p>
+    <w:p>
+      <w:pPr>
+        <w:pStyle w:val="NormalWeb"/>
+        <w:numPr>
+          <w:ilvl w:val="0"/>
+          <w:numId w:val="49"/>
+        </w:numPr>
+      </w:pPr>
+      <w:r>
+        <w:t>requests module</w:t>
+      </w:r>
+    </w:p>
+    <w:p>
+      <w:pPr>
+        <w:pStyle w:val="NormalWeb"/>
+        <w:numPr>
+          <w:ilvl w:val="0"/>
+          <w:numId w:val="49"/>
+        </w:numPr>
+      </w:pPr>
+      <w:r>
+        <w:rPr>
+          <w:b/>
+          <w:bCs/>
+          <w:noProof/>
+        </w:rPr>
+        <mc:AlternateContent>
+          <mc:Choice Requires="wps">
+            <w:drawing>
+              <wp:anchor distT="0" distB="0" distL="114300" distR="114300" simplePos="0" relativeHeight="251759616" behindDoc="0" locked="0" layoutInCell="1" allowOverlap="1" wp14:anchorId="54C656DB" wp14:editId="57FF039F">
+                <wp:simplePos x="0" y="0"/>
+                <wp:positionH relativeFrom="margin">
+                  <wp:posOffset>-95693</wp:posOffset>
+                </wp:positionH>
+                <wp:positionV relativeFrom="paragraph">
+                  <wp:posOffset>323732</wp:posOffset>
+                </wp:positionV>
+                <wp:extent cx="5625389" cy="1020725"/>
+                <wp:effectExtent l="19050" t="19050" r="13970" b="27305"/>
+                <wp:wrapNone/>
+                <wp:docPr id="50" name="Text Box 50"/>
+                <wp:cNvGraphicFramePr/>
+                <a:graphic xmlns:a="http://schemas.openxmlformats.org/drawingml/2006/main">
+                  <a:graphicData uri="http://schemas.microsoft.com/office/word/2010/wordprocessingShape">
+                    <wps:wsp>
+                      <wps:cNvSpPr txBox="1"/>
+                      <wps:spPr>
+                        <a:xfrm>
+                          <a:off x="0" y="0"/>
+                          <a:ext cx="5625389" cy="1020725"/>
+                        </a:xfrm>
+                        <a:prstGeom prst="rect">
+                          <a:avLst/>
+                        </a:prstGeom>
+                        <a:noFill/>
+                        <a:ln w="38100">
+                          <a:solidFill>
+                            <a:srgbClr val="00FF00"/>
+                          </a:solidFill>
+                        </a:ln>
+                      </wps:spPr>
+                      <wps:txbx>
+                        <w:txbxContent>
+                          <w:p/>
+                          <w:p/>
+                          <w:p/>
+                        </w:txbxContent>
+                      </wps:txbx>
+                      <wps:bodyPr rot="0" spcFirstLastPara="0" vertOverflow="overflow" horzOverflow="overflow" vert="horz" wrap="square" lIns="91440" tIns="45720" rIns="91440" bIns="45720" numCol="1" spcCol="0" rtlCol="0" fromWordArt="0" anchor="t" anchorCtr="0" forceAA="0" compatLnSpc="1">
+                        <a:prstTxWarp prst="textNoShape">
+                          <a:avLst/>
+                        </a:prstTxWarp>
+                        <a:noAutofit/>
+                      </wps:bodyPr>
+                    </wps:wsp>
+                  </a:graphicData>
+                </a:graphic>
+                <wp14:sizeRelH relativeFrom="margin">
+                  <wp14:pctWidth>0</wp14:pctWidth>
+                </wp14:sizeRelH>
+                <wp14:sizeRelV relativeFrom="margin">
+                  <wp14:pctHeight>0</wp14:pctHeight>
+                </wp14:sizeRelV>
+              </wp:anchor>
+            </w:drawing>
+          </mc:Choice>
+          <mc:Fallback>
+            <w:pict>
+              <v:shape w14:anchorId="54C656DB" id="Text Box 50" o:spid="_x0000_s1075" type="#_x0000_t202" style="position:absolute;left:0;text-align:left;margin-left:-7.55pt;margin-top:25.5pt;width:442.95pt;height:80.35pt;z-index:251759616;visibility:visible;mso-wrap-style:square;mso-width-percent:0;mso-height-percent:0;mso-wrap-distance-left:9pt;mso-wrap-distance-top:0;mso-wrap-distance-right:9pt;mso-wrap-distance-bottom:0;mso-position-horizontal:absolute;mso-position-horizontal-relative:margin;mso-position-vertical:absolute;mso-position-vertical-relative:text;mso-width-percent:0;mso-height-percent:0;mso-width-relative:margin;mso-height-relative:margin;v-text-anchor:top" o:gfxdata="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" filled="f" strokecolor="lime" strokeweight="3pt">
+                <v:textbox>
+                  <w:txbxContent>
+                    <w:p/>
+                    <w:p/>
+                    <w:p/>
+                  </w:txbxContent>
+                </v:textbox>
+                <w10:wrap anchorx="margin"/>
+              </v:shape>
+            </w:pict>
+          </mc:Fallback>
+        </mc:AlternateContent>
+      </w:r>
+      <w:r>
+        <w:t>JSON handling</w:t>
+      </w:r>
+    </w:p>
+    <w:p>
+      <w:pPr>
+        <w:pStyle w:val="Heading3"/>
+      </w:pPr>
+      <w:r>
+        <w:rPr>
+          <w:rStyle w:val="Strong"/>
+          <w:b/>
+          <w:bCs/>
+        </w:rPr>
+        <w:t>Week 49</w:t>
+      </w:r>
+    </w:p>
+    <w:p>
+      <w:pPr>
+        <w:pStyle w:val="NormalWeb"/>
+      </w:pPr>
+      <w:r>
+        <w:rPr>
+          <w:rFonts w:ascii="Segoe UI Symbol" w:hAnsi="Segoe UI Symbol" w:cs="Segoe UI Symbol"/>
+        </w:rPr>
+        <w:t>🔸</w:t>
+      </w:r>
+      <w:r>
+        <w:t xml:space="preserve"> </w:t>
+      </w:r>
+      <w:r>
+        <w:rPr>
+          <w:rStyle w:val="Strong"/>
+        </w:rPr>
+        <w:t>24. Working with APIs</w:t>
+      </w:r>
+    </w:p>
+    <w:p>
+      <w:pPr>
+        <w:pStyle w:val="NormalWeb"/>
+        <w:numPr>
+          <w:ilvl w:val="0"/>
+          <w:numId w:val="50"/>
+        </w:numPr>
+      </w:pPr>
+      <w:r>
+        <w:rPr>
+          <w:b/>
+          <w:bCs/>
+          <w:noProof/>
+        </w:rPr>
+        <mc:AlternateContent>
+          <mc:Choice Requires="wps">
+            <w:drawing>
+              <wp:anchor distT="0" distB="0" distL="114300" distR="114300" simplePos="0" relativeHeight="251761664" behindDoc="0" locked="0" layoutInCell="1" allowOverlap="1" wp14:anchorId="17842492" wp14:editId="437BC4FD">
+                <wp:simplePos x="0" y="0"/>
+                <wp:positionH relativeFrom="margin">
+                  <wp:posOffset>-95693</wp:posOffset>
+                </wp:positionH>
+                <wp:positionV relativeFrom="paragraph">
+                  <wp:posOffset>331440</wp:posOffset>
+                </wp:positionV>
+                <wp:extent cx="5625389" cy="1265275"/>
+                <wp:effectExtent l="19050" t="19050" r="13970" b="11430"/>
+                <wp:wrapNone/>
+                <wp:docPr id="51" name="Text Box 51"/>
+                <wp:cNvGraphicFramePr/>
+                <a:graphic xmlns:a="http://schemas.openxmlformats.org/drawingml/2006/main">
+                  <a:graphicData uri="http://schemas.microsoft.com/office/word/2010/wordprocessingShape">
+                    <wps:wsp>
+                      <wps:cNvSpPr txBox="1"/>
+                      <wps:spPr>
+                        <a:xfrm>
+                          <a:off x="0" y="0"/>
+                          <a:ext cx="5625389" cy="1265275"/>
+                        </a:xfrm>
+                        <a:prstGeom prst="rect">
+                          <a:avLst/>
+                        </a:prstGeom>
+                        <a:noFill/>
+                        <a:ln w="38100">
+                          <a:solidFill>
+                            <a:srgbClr val="00FF00"/>
+                          </a:solidFill>
+                        </a:ln>
+                      </wps:spPr>
+                      <wps:txbx>
+                        <w:txbxContent>
+                          <w:p/>
+                          <w:p/>
+                          <w:p/>
+                        </w:txbxContent>
+                      </wps:txbx>
+                      <wps:bodyPr rot="0" spcFirstLastPara="0" vertOverflow="overflow" horzOverflow="overflow" vert="horz" wrap="square" lIns="91440" tIns="45720" rIns="91440" bIns="45720" numCol="1" spcCol="0" rtlCol="0" fromWordArt="0" anchor="t" anchorCtr="0" forceAA="0" compatLnSpc="1">
+                        <a:prstTxWarp prst="textNoShape">
+                          <a:avLst/>
+                        </a:prstTxWarp>
+                        <a:noAutofit/>
+                      </wps:bodyPr>
+                    </wps:wsp>
+                  </a:graphicData>
+                </a:graphic>
+                <wp14:sizeRelH relativeFrom="margin">
+                  <wp14:pctWidth>0</wp14:pctWidth>
+                </wp14:sizeRelH>
+                <wp14:sizeRelV relativeFrom="margin">
+                  <wp14:pctHeight>0</wp14:pctHeight>
+                </wp14:sizeRelV>
+              </wp:anchor>
+            </w:drawing>
+          </mc:Choice>
+          <mc:Fallback>
+            <w:pict>
+              <v:shape w14:anchorId="17842492" id="Text Box 51" o:spid="_x0000_s1076" type="#_x0000_t202" style="position:absolute;left:0;text-align:left;margin-left:-7.55pt;margin-top:26.1pt;width:442.95pt;height:99.65pt;z-index:251761664;visibility:visible;mso-wrap-style:square;mso-width-percent:0;mso-height-percent:0;mso-wrap-distance-left:9pt;mso-wrap-distance-top:0;mso-wrap-distance-right:9pt;mso-wrap-distance-bottom:0;mso-position-horizontal:absolute;mso-position-horizontal-relative:margin;mso-position-vertical:absolute;mso-position-vertical-relative:text;mso-width-percent:0;mso-height-percent:0;mso-width-relative:margin;mso-height-relative:margin;v-text-anchor:top" o:gfxdata="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" filled="f" strokecolor="lime" strokeweight="3pt">
+                <v:textbox>
+                  <w:txbxContent>
+                    <w:p/>
+                    <w:p/>
+                    <w:p/>
+                  </w:txbxContent>
+                </v:textbox>
+                <w10:wrap anchorx="margin"/>
+              </v:shape>
+            </w:pict>
+          </mc:Fallback>
+        </mc:AlternateContent>
+      </w:r>
+      <w:r>
+        <w:t>Authentication and headers</w:t>
+      </w:r>
+    </w:p>
+    <w:p>
+      <w:pPr>
+        <w:pStyle w:val="Heading3"/>
+      </w:pPr>
+      <w:r>
+        <w:rPr>
+          <w:rStyle w:val="Strong"/>
+          <w:b/>
+          <w:bCs/>
+        </w:rPr>
+        <w:t>Week 50</w:t>
+      </w:r>
+    </w:p>
+    <w:p>
+      <w:pPr>
+        <w:pStyle w:val="NormalWeb"/>
+      </w:pPr>
+      <w:r>
+        <w:rPr>
+          <w:rFonts w:ascii="Segoe UI Symbol" w:hAnsi="Segoe UI Symbol" w:cs="Segoe UI Symbol"/>
+        </w:rPr>
+        <w:t>🔸</w:t>
+      </w:r>
+      <w:r>
+        <w:t xml:space="preserve"> </w:t>
+      </w:r>
+      <w:r>
+        <w:rPr>
+          <w:rStyle w:val="Strong"/>
+        </w:rPr>
+        <w:t>25. Databases</w:t>
+      </w:r>
+    </w:p>
+    <w:p>
+      <w:pPr>
+        <w:pStyle w:val="NormalWeb"/>
+        <w:numPr>
+          <w:ilvl w:val="0"/>
+          <w:numId w:val="51"/>
+        </w:numPr>
+      </w:pPr>
+      <w:r>
+        <w:t>SQLite3 basics</w:t>
+      </w:r>
+    </w:p>
+    <w:p>
+      <w:pPr>
+        <w:pStyle w:val="NormalWeb"/>
+        <w:numPr>
+          <w:ilvl w:val="0"/>
+          <w:numId w:val="51"/>
+        </w:numPr>
+      </w:pPr>
+      <w:r>
+        <w:t>CRUD operations</w:t>
+      </w:r>
+    </w:p>
+    <w:p>
+      <w:r>
+        <w:rPr>
+          <w:b/>
+          <w:bCs/>
+          <w:noProof/>
+        </w:rPr>
+        <mc:AlternateContent>
+          <mc:Choice Requires="wps">
+            <w:drawing>
+              <wp:anchor distT="0" distB="0" distL="114300" distR="114300" simplePos="0" relativeHeight="251763712" behindDoc="0" locked="0" layoutInCell="1" allowOverlap="1" wp14:anchorId="2B7D237F" wp14:editId="7AC78916">
+                <wp:simplePos x="0" y="0"/>
+                <wp:positionH relativeFrom="margin">
+                  <wp:posOffset>-95693</wp:posOffset>
+                </wp:positionH>
+                <wp:positionV relativeFrom="paragraph">
+                  <wp:posOffset>268664</wp:posOffset>
+                </wp:positionV>
+                <wp:extent cx="5625389" cy="1871330"/>
+                <wp:effectExtent l="19050" t="19050" r="13970" b="15240"/>
+                <wp:wrapNone/>
+                <wp:docPr id="52" name="Text Box 52"/>
+                <wp:cNvGraphicFramePr/>
+                <a:graphic xmlns:a="http://schemas.openxmlformats.org/drawingml/2006/main">
+                  <a:graphicData uri="http://schemas.microsoft.com/office/word/2010/wordprocessingShape">
+                    <wps:wsp>
+                      <wps:cNvSpPr txBox="1"/>
+                      <wps:spPr>
+                        <a:xfrm>
+                          <a:off x="0" y="0"/>
+                          <a:ext cx="5625389" cy="1871330"/>
+                        </a:xfrm>
+                        <a:prstGeom prst="rect">
+                          <a:avLst/>
+                        </a:prstGeom>
+                        <a:noFill/>
+                        <a:ln w="38100">
+                          <a:solidFill>
+                            <a:srgbClr val="00FF00"/>
+                          </a:solidFill>
+                        </a:ln>
+                      </wps:spPr>
+                      <wps:txbx>
+                        <w:txbxContent>
+                          <w:p/>
+                          <w:p/>
+                          <w:p/>
+                        </w:txbxContent>
+                      </wps:txbx>
+                      <wps:bodyPr rot="0" spcFirstLastPara="0" vertOverflow="overflow" horzOverflow="overflow" vert="horz" wrap="square" lIns="91440" tIns="45720" rIns="91440" bIns="45720" numCol="1" spcCol="0" rtlCol="0" fromWordArt="0" anchor="t" anchorCtr="0" forceAA="0" compatLnSpc="1">
+                        <a:prstTxWarp prst="textNoShape">
+                          <a:avLst/>
+                        </a:prstTxWarp>
+                        <a:noAutofit/>
+                      </wps:bodyPr>
+                    </wps:wsp>
+                  </a:graphicData>
+                </a:graphic>
+                <wp14:sizeRelH relativeFrom="margin">
+                  <wp14:pctWidth>0</wp14:pctWidth>
+                </wp14:sizeRelH>
+                <wp14:sizeRelV relativeFrom="margin">
+                  <wp14:pctHeight>0</wp14:pctHeight>
+                </wp14:sizeRelV>
+              </wp:anchor>
+            </w:drawing>
+          </mc:Choice>
+          <mc:Fallback>
+            <w:pict>
+              <v:shape w14:anchorId="2B7D237F" id="Text Box 52" o:spid="_x0000_s1077" type="#_x0000_t202" style="position:absolute;margin-left:-7.55pt;margin-top:21.15pt;width:442.95pt;height:147.35pt;z-index:251763712;visibility:visible;mso-wrap-style:square;mso-width-percent:0;mso-height-percent:0;mso-wrap-distance-left:9pt;mso-wrap-distance-top:0;mso-wrap-distance-right:9pt;mso-wrap-distance-bottom:0;mso-position-horizontal:absolute;mso-position-horizontal-relative:margin;mso-position-vertical:absolute;mso-position-vertical-relative:text;mso-width-percent:0;mso-height-percent:0;mso-width-relative:margin;mso-height-relative:margin;v-text-anchor:top" o:gfxdata="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" filled="f" strokecolor="lime" strokeweight="3pt">
+                <v:textbox>
+                  <w:txbxContent>
+                    <w:p/>
+                    <w:p/>
+                    <w:p/>
+                  </w:txbxContent>
+                </v:textbox>
+                <w10:wrap anchorx="margin"/>
+              </v:shape>
+            </w:pict>
+          </mc:Fallback>
+        </mc:AlternateContent>
+      </w:r>
+      <w:r>
+        <w:pict>
+          <v:rect id="_x0000_i1035" style="width:0;height:1.5pt" o:hralign="center" o:hrstd="t" o:hr="t" fillcolor="#a0a0a0" stroked="f"/>
+        </w:pict>
+      </w:r>
+    </w:p>
+    <w:p>
+      <w:pPr>
+        <w:pStyle w:val="Heading2"/>
+      </w:pPr>
+      <w:r>
+        <w:rPr>
+          <w:rFonts w:ascii="Segoe UI Symbol" w:hAnsi="Segoe UI Symbol" w:cs="Segoe UI Symbol"/>
+        </w:rPr>
+        <w:t>🔴</w:t>
+      </w:r>
+      <w:r>
+        <w:t xml:space="preserve"> MONTH 13 — EXPERT LEVEL (Specialization &amp; Industry Skills)</w:t>
+      </w:r>
+    </w:p>
+    <w:p>
+      <w:pPr>
+        <w:pStyle w:val="Heading3"/>
+      </w:pPr>
+      <w:r>
+        <w:rPr>
+          <w:rStyle w:val="Strong"/>
+          <w:b/>
+          <w:bCs/>
+        </w:rPr>
+        <w:t>Week 51</w:t>
+      </w:r>
+    </w:p>
+    <w:p>
+      <w:pPr>
+        <w:pStyle w:val="NormalWeb"/>
+      </w:pPr>
+      <w:r>
+        <w:rPr>
+          <w:rFonts w:ascii="Segoe UI Symbol" w:hAnsi="Segoe UI Symbol" w:cs="Segoe UI Symbol"/>
+        </w:rPr>
+        <w:t>🔸</w:t>
+      </w:r>
+      <w:r>
+        <w:t xml:space="preserve"> </w:t>
+      </w:r>
+      <w:r>
+        <w:rPr>
+          <w:rStyle w:val="Strong"/>
+        </w:rPr>
+        <w:t>25. Databases</w:t>
+      </w:r>
+    </w:p>
+    <w:p>
+      <w:pPr>
+        <w:pStyle w:val="NormalWeb"/>
+        <w:numPr>
+          <w:ilvl w:val="0"/>
+          <w:numId w:val="52"/>
+        </w:numPr>
+      </w:pPr>
+      <w:r>
+        <w:t xml:space="preserve">Using ORMs (e.g., </w:t>
+      </w:r>
+      <w:proofErr w:type="spellStart"/>
+      <w:r>
+        <w:t>SQLAlchemy</w:t>
+      </w:r>
+      <w:proofErr w:type="spellEnd"/>
+      <w:r>
+        <w:t>)</w:t>
+      </w:r>
+    </w:p>
+    <w:p>
+      <w:pPr>
+        <w:pStyle w:val="Heading3"/>
+        <w:rPr>
+          <w:rStyle w:val="Strong"/>
+          <w:b/>
+          <w:bCs/>
+        </w:rPr>
+      </w:pPr>
+    </w:p>
+    <w:p>
+      <w:pPr>
+        <w:pStyle w:val="Heading3"/>
+      </w:pPr>
+      <w:r>
+        <w:rPr>
+          <w:b w:val="0"/>
+          <w:bCs w:val="0"/>
+          <w:noProof/>
+        </w:rPr>
+        <w:lastRenderedPageBreak/>
+        <mc:AlternateContent>
+          <mc:Choice Requires="wps">
+            <w:drawing>
+              <wp:anchor distT="0" distB="0" distL="114300" distR="114300" simplePos="0" relativeHeight="251765760" behindDoc="0" locked="0" layoutInCell="1" allowOverlap="1" wp14:anchorId="73563207" wp14:editId="4CCA1CD2">
+                <wp:simplePos x="0" y="0"/>
+                <wp:positionH relativeFrom="margin">
+                  <wp:posOffset>-138223</wp:posOffset>
+                </wp:positionH>
+                <wp:positionV relativeFrom="paragraph">
+                  <wp:posOffset>-138223</wp:posOffset>
+                </wp:positionV>
+                <wp:extent cx="5625389" cy="1350335"/>
+                <wp:effectExtent l="19050" t="19050" r="13970" b="21590"/>
+                <wp:wrapNone/>
+                <wp:docPr id="53" name="Text Box 53"/>
+                <wp:cNvGraphicFramePr/>
+                <a:graphic xmlns:a="http://schemas.openxmlformats.org/drawingml/2006/main">
+                  <a:graphicData uri="http://schemas.microsoft.com/office/word/2010/wordprocessingShape">
+                    <wps:wsp>
+                      <wps:cNvSpPr txBox="1"/>
+                      <wps:spPr>
+                        <a:xfrm>
+                          <a:off x="0" y="0"/>
+                          <a:ext cx="5625389" cy="1350335"/>
                         </a:xfrm>
                         <a:prstGeom prst="rect">
                           <a:avLst/>
@@ -9250,7 +10812,7 @@
           </mc:Choice>
           <mc:Fallback>
             <w:pict>
-              <v:shape w14:anchorId="549EABF4" id="Text Box 19" o:spid="_x0000_s1067" type="#_x0000_t202" style="position:absolute;left:0;text-align:left;margin-left:-27.1pt;margin-top:25.55pt;width:442.95pt;height:94.9pt;z-index:251743232;visibility:visible;mso-wrap-style:square;mso-width-percent:0;mso-height-percent:0;mso-wrap-distance-left:9pt;mso-wrap-distance-top:0;mso-wrap-distance-right:9pt;mso-wrap-distance-bottom:0;mso-position-horizontal:absolute;mso-position-horizontal-relative:margin;mso-position-vertical:absolute;mso-position-vertical-relative:text;mso-width-percent:0;mso-height-percent:0;mso-width-relative:margin;mso-height-relative:margin;v-text-anchor:top" o:gfxdata="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" filled="f" strokecolor="lime" strokeweight="3pt">
+              <v:shape w14:anchorId="73563207" id="Text Box 53" o:spid="_x0000_s1078" type="#_x0000_t202" style="position:absolute;margin-left:-10.9pt;margin-top:-10.9pt;width:442.95pt;height:106.35pt;z-index:251765760;visibility:visible;mso-wrap-style:square;mso-width-percent:0;mso-height-percent:0;mso-wrap-distance-left:9pt;mso-wrap-distance-top:0;mso-wrap-distance-right:9pt;mso-wrap-distance-bottom:0;mso-position-horizontal:absolute;mso-position-horizontal-relative:margin;mso-position-vertical:absolute;mso-position-vertical-relative:text;mso-width-percent:0;mso-height-percent:0;mso-width-relative:margin;mso-height-relative:margin;v-text-anchor:top" o:gfxdata="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" filled="f" strokecolor="lime" strokeweight="3pt">
                 <v:textbox>
                   <w:txbxContent>
                     <w:p>
@@ -9267,58 +10829,13 @@
           </mc:Fallback>
         </mc:AlternateContent>
       </w:r>
-      <w:proofErr w:type="spellStart"/>
-      <w:r>
-        <w:t>os</w:t>
-      </w:r>
-      <w:proofErr w:type="spellEnd"/>
-      <w:r>
-        <w:t xml:space="preserve">, sys, </w:t>
-      </w:r>
-      <w:proofErr w:type="spellStart"/>
-      <w:r>
-        <w:t>datetime</w:t>
-      </w:r>
-      <w:proofErr w:type="spellEnd"/>
-      <w:r>
-        <w:t xml:space="preserve">, re, math, </w:t>
-      </w:r>
-      <w:proofErr w:type="spellStart"/>
-      <w:r>
-        <w:t>json</w:t>
-      </w:r>
-      <w:proofErr w:type="spellEnd"/>
-      <w:r>
-        <w:t xml:space="preserve">, csv, </w:t>
-      </w:r>
-      <w:proofErr w:type="spellStart"/>
-      <w:r>
-        <w:t>shutil</w:t>
-      </w:r>
-      <w:proofErr w:type="spellEnd"/>
-      <w:r>
-        <w:t xml:space="preserve">, </w:t>
-      </w:r>
-      <w:proofErr w:type="spellStart"/>
-      <w:r>
-        <w:t>subprocess</w:t>
-      </w:r>
-      <w:proofErr w:type="spellEnd"/>
-      <w:r>
-        <w:t>, logging</w:t>
-      </w:r>
-    </w:p>
-    <w:p>
-      <w:pPr>
-        <w:pStyle w:val="Heading3"/>
-      </w:pPr>
       <w:r>
         <w:rPr>
           <w:rStyle w:val="Strong"/>
           <w:b/>
           <w:bCs/>
         </w:rPr>
-        <w:t>Week 42</w:t>
+        <w:t>Week 52</w:t>
       </w:r>
     </w:p>
     <w:p>
@@ -9329,607 +10846,6 @@
         <w:rPr>
           <w:rFonts w:ascii="Segoe UI Symbol" w:hAnsi="Segoe UI Symbol" w:cs="Segoe UI Symbol"/>
         </w:rPr>
-        <w:t>🔸</w:t>
-      </w:r>
-      <w:r>
-        <w:t xml:space="preserve"> </w:t>
-      </w:r>
-      <w:r>
-        <w:rPr>
-          <w:rStyle w:val="Strong"/>
-        </w:rPr>
-        <w:t>21. Comprehensions</w:t>
-      </w:r>
-    </w:p>
-    <w:p>
-      <w:pPr>
-        <w:pStyle w:val="NormalWeb"/>
-        <w:numPr>
-          <w:ilvl w:val="0"/>
-          <w:numId w:val="43"/>
-        </w:numPr>
-      </w:pPr>
-      <w:r>
-        <w:t>List comprehensions</w:t>
-      </w:r>
-    </w:p>
-    <w:p>
-      <w:pPr>
-        <w:pStyle w:val="NormalWeb"/>
-        <w:numPr>
-          <w:ilvl w:val="0"/>
-          <w:numId w:val="43"/>
-        </w:numPr>
-      </w:pPr>
-      <w:r>
-        <w:t>Dictionary and set comprehensions</w:t>
-      </w:r>
-    </w:p>
-    <w:p>
-      <w:r>
-        <w:pict>
-          <v:rect id="_x0000_i1033" style="width:0;height:1.5pt" o:hralign="center" o:hrstd="t" o:hr="t" fillcolor="#a0a0a0" stroked="f"/>
-        </w:pict>
-      </w:r>
-    </w:p>
-    <w:p>
-      <w:pPr>
-        <w:pStyle w:val="Heading2"/>
-      </w:pPr>
-      <w:r>
-        <w:rPr>
-          <w:rFonts w:ascii="Segoe UI Symbol" w:hAnsi="Segoe UI Symbol" w:cs="Segoe UI Symbol"/>
-        </w:rPr>
-        <w:t>🔴</w:t>
-      </w:r>
-      <w:r>
-        <w:t xml:space="preserve"> MONTH 11 — EXPERT LEVEL (Real-World Applications)</w:t>
-      </w:r>
-    </w:p>
-    <w:p>
-      <w:pPr>
-        <w:pStyle w:val="Heading3"/>
-      </w:pPr>
-      <w:r>
-        <w:rPr>
-          <w:rStyle w:val="Strong"/>
-          <w:b/>
-          <w:bCs/>
-        </w:rPr>
-        <w:t>Week 43</w:t>
-      </w:r>
-    </w:p>
-    <w:p>
-      <w:pPr>
-        <w:pStyle w:val="NormalWeb"/>
-      </w:pPr>
-      <w:r>
-        <w:rPr>
-          <w:rFonts w:ascii="Segoe UI Symbol" w:hAnsi="Segoe UI Symbol" w:cs="Segoe UI Symbol"/>
-        </w:rPr>
-        <w:t>🔸</w:t>
-      </w:r>
-      <w:r>
-        <w:t xml:space="preserve"> </w:t>
-      </w:r>
-      <w:r>
-        <w:rPr>
-          <w:rStyle w:val="Strong"/>
-        </w:rPr>
-        <w:t>21. Comprehensions</w:t>
-      </w:r>
-    </w:p>
-    <w:p>
-      <w:pPr>
-        <w:pStyle w:val="NormalWeb"/>
-        <w:numPr>
-          <w:ilvl w:val="0"/>
-          <w:numId w:val="44"/>
-        </w:numPr>
-      </w:pPr>
-      <w:r>
-        <w:t>Nested comprehensions</w:t>
-      </w:r>
-    </w:p>
-    <w:p>
-      <w:pPr>
-        <w:pStyle w:val="Heading3"/>
-      </w:pPr>
-      <w:r>
-        <w:rPr>
-          <w:rStyle w:val="Strong"/>
-          <w:b/>
-          <w:bCs/>
-        </w:rPr>
-        <w:t>Week 44</w:t>
-      </w:r>
-    </w:p>
-    <w:p>
-      <w:pPr>
-        <w:pStyle w:val="NormalWeb"/>
-      </w:pPr>
-      <w:r>
-        <w:rPr>
-          <w:rFonts w:ascii="Segoe UI Symbol" w:hAnsi="Segoe UI Symbol" w:cs="Segoe UI Symbol"/>
-        </w:rPr>
-        <w:t>🔸</w:t>
-      </w:r>
-      <w:r>
-        <w:t xml:space="preserve"> </w:t>
-      </w:r>
-      <w:r>
-        <w:rPr>
-          <w:rStyle w:val="Strong"/>
-        </w:rPr>
-        <w:t>22. Regular Expressions (re)</w:t>
-      </w:r>
-    </w:p>
-    <w:p>
-      <w:pPr>
-        <w:pStyle w:val="NormalWeb"/>
-        <w:numPr>
-          <w:ilvl w:val="0"/>
-          <w:numId w:val="45"/>
-        </w:numPr>
-      </w:pPr>
-      <w:proofErr w:type="gramStart"/>
-      <w:r>
-        <w:t>match(</w:t>
-      </w:r>
-      <w:proofErr w:type="gramEnd"/>
-      <w:r>
-        <w:t xml:space="preserve">), search(), </w:t>
-      </w:r>
-      <w:proofErr w:type="spellStart"/>
-      <w:r>
-        <w:t>findall</w:t>
-      </w:r>
-      <w:proofErr w:type="spellEnd"/>
-      <w:r>
-        <w:t>(), sub()</w:t>
-      </w:r>
-    </w:p>
-    <w:p>
-      <w:pPr>
-        <w:pStyle w:val="NormalWeb"/>
-        <w:numPr>
-          <w:ilvl w:val="0"/>
-          <w:numId w:val="45"/>
-        </w:numPr>
-      </w:pPr>
-      <w:r>
-        <w:t>Meta-characters and groups</w:t>
-      </w:r>
-    </w:p>
-    <w:p>
-      <w:pPr>
-        <w:pStyle w:val="Heading3"/>
-      </w:pPr>
-      <w:r>
-        <w:rPr>
-          <w:rStyle w:val="Strong"/>
-          <w:b/>
-          <w:bCs/>
-        </w:rPr>
-        <w:t>Week 45</w:t>
-      </w:r>
-    </w:p>
-    <w:p>
-      <w:pPr>
-        <w:pStyle w:val="NormalWeb"/>
-      </w:pPr>
-      <w:r>
-        <w:rPr>
-          <w:rFonts w:ascii="Segoe UI Symbol" w:hAnsi="Segoe UI Symbol" w:cs="Segoe UI Symbol"/>
-        </w:rPr>
-        <w:t>🔸</w:t>
-      </w:r>
-      <w:r>
-        <w:t xml:space="preserve"> </w:t>
-      </w:r>
-      <w:r>
-        <w:rPr>
-          <w:rStyle w:val="Strong"/>
-        </w:rPr>
-        <w:t>22. Regular Expressions (re)</w:t>
-      </w:r>
-    </w:p>
-    <w:p>
-      <w:pPr>
-        <w:pStyle w:val="NormalWeb"/>
-        <w:numPr>
-          <w:ilvl w:val="0"/>
-          <w:numId w:val="46"/>
-        </w:numPr>
-      </w:pPr>
-      <w:r>
-        <w:t>Raw strings for regex</w:t>
-      </w:r>
-    </w:p>
-    <w:p>
-      <w:pPr>
-        <w:pStyle w:val="Heading3"/>
-      </w:pPr>
-      <w:r>
-        <w:rPr>
-          <w:rStyle w:val="Strong"/>
-          <w:b/>
-          <w:bCs/>
-        </w:rPr>
-        <w:t>Week 46</w:t>
-      </w:r>
-    </w:p>
-    <w:p>
-      <w:pPr>
-        <w:pStyle w:val="NormalWeb"/>
-      </w:pPr>
-      <w:r>
-        <w:rPr>
-          <w:rFonts w:ascii="Segoe UI Symbol" w:hAnsi="Segoe UI Symbol" w:cs="Segoe UI Symbol"/>
-        </w:rPr>
-        <w:t>🔸</w:t>
-      </w:r>
-      <w:r>
-        <w:t xml:space="preserve"> </w:t>
-      </w:r>
-      <w:r>
-        <w:rPr>
-          <w:rStyle w:val="Strong"/>
-        </w:rPr>
-        <w:t>23. Functional Programming</w:t>
-      </w:r>
-    </w:p>
-    <w:p>
-      <w:pPr>
-        <w:pStyle w:val="NormalWeb"/>
-        <w:numPr>
-          <w:ilvl w:val="0"/>
-          <w:numId w:val="47"/>
-        </w:numPr>
-      </w:pPr>
-      <w:proofErr w:type="gramStart"/>
-      <w:r>
-        <w:lastRenderedPageBreak/>
-        <w:t>map(</w:t>
-      </w:r>
-      <w:proofErr w:type="gramEnd"/>
-      <w:r>
-        <w:t>), filter(), reduce()</w:t>
-      </w:r>
-    </w:p>
-    <w:p>
-      <w:pPr>
-        <w:pStyle w:val="NormalWeb"/>
-        <w:numPr>
-          <w:ilvl w:val="0"/>
-          <w:numId w:val="47"/>
-        </w:numPr>
-      </w:pPr>
-      <w:r>
-        <w:t>Higher-order functions</w:t>
-      </w:r>
-    </w:p>
-    <w:p>
-      <w:r>
-        <w:pict>
-          <v:rect id="_x0000_i1034" style="width:0;height:1.5pt" o:hralign="center" o:hrstd="t" o:hr="t" fillcolor="#a0a0a0" stroked="f"/>
-        </w:pict>
-      </w:r>
-    </w:p>
-    <w:p>
-      <w:pPr>
-        <w:pStyle w:val="Heading2"/>
-      </w:pPr>
-      <w:r>
-        <w:rPr>
-          <w:rFonts w:ascii="Segoe UI Symbol" w:hAnsi="Segoe UI Symbol" w:cs="Segoe UI Symbol"/>
-        </w:rPr>
-        <w:t>🔴</w:t>
-      </w:r>
-      <w:r>
-        <w:t xml:space="preserve"> MONTH 12 — EXPERT LEVEL (Real-World Applications)</w:t>
-      </w:r>
-    </w:p>
-    <w:p>
-      <w:pPr>
-        <w:pStyle w:val="Heading3"/>
-      </w:pPr>
-      <w:r>
-        <w:rPr>
-          <w:rStyle w:val="Strong"/>
-          <w:b/>
-          <w:bCs/>
-        </w:rPr>
-        <w:t>Week 47</w:t>
-      </w:r>
-    </w:p>
-    <w:p>
-      <w:pPr>
-        <w:pStyle w:val="NormalWeb"/>
-      </w:pPr>
-      <w:r>
-        <w:rPr>
-          <w:rFonts w:ascii="Segoe UI Symbol" w:hAnsi="Segoe UI Symbol" w:cs="Segoe UI Symbol"/>
-        </w:rPr>
-        <w:t>🔸</w:t>
-      </w:r>
-      <w:r>
-        <w:t xml:space="preserve"> </w:t>
-      </w:r>
-      <w:r>
-        <w:rPr>
-          <w:rStyle w:val="Strong"/>
-        </w:rPr>
-        <w:t>23. Functional Programming</w:t>
-      </w:r>
-    </w:p>
-    <w:p>
-      <w:pPr>
-        <w:pStyle w:val="NormalWeb"/>
-        <w:numPr>
-          <w:ilvl w:val="0"/>
-          <w:numId w:val="48"/>
-        </w:numPr>
-      </w:pPr>
-      <w:r>
-        <w:t>Closures</w:t>
-      </w:r>
-    </w:p>
-    <w:p>
-      <w:pPr>
-        <w:pStyle w:val="Heading3"/>
-      </w:pPr>
-      <w:r>
-        <w:rPr>
-          <w:rStyle w:val="Strong"/>
-          <w:b/>
-          <w:bCs/>
-        </w:rPr>
-        <w:t>Week 48</w:t>
-      </w:r>
-    </w:p>
-    <w:p>
-      <w:pPr>
-        <w:pStyle w:val="NormalWeb"/>
-      </w:pPr>
-      <w:r>
-        <w:rPr>
-          <w:rFonts w:ascii="Segoe UI Symbol" w:hAnsi="Segoe UI Symbol" w:cs="Segoe UI Symbol"/>
-        </w:rPr>
-        <w:t>🔸</w:t>
-      </w:r>
-      <w:r>
-        <w:t xml:space="preserve"> </w:t>
-      </w:r>
-      <w:r>
-        <w:rPr>
-          <w:rStyle w:val="Strong"/>
-        </w:rPr>
-        <w:t>24. Working with APIs</w:t>
-      </w:r>
-    </w:p>
-    <w:p>
-      <w:pPr>
-        <w:pStyle w:val="NormalWeb"/>
-        <w:numPr>
-          <w:ilvl w:val="0"/>
-          <w:numId w:val="49"/>
-        </w:numPr>
-      </w:pPr>
-      <w:r>
-        <w:t>requests module</w:t>
-      </w:r>
-    </w:p>
-    <w:p>
-      <w:pPr>
-        <w:pStyle w:val="NormalWeb"/>
-        <w:numPr>
-          <w:ilvl w:val="0"/>
-          <w:numId w:val="49"/>
-        </w:numPr>
-      </w:pPr>
-      <w:r>
-        <w:t>JSON handling</w:t>
-      </w:r>
-    </w:p>
-    <w:p>
-      <w:pPr>
-        <w:pStyle w:val="Heading3"/>
-      </w:pPr>
-      <w:r>
-        <w:rPr>
-          <w:rStyle w:val="Strong"/>
-          <w:b/>
-          <w:bCs/>
-        </w:rPr>
-        <w:t>Week 49</w:t>
-      </w:r>
-    </w:p>
-    <w:p>
-      <w:pPr>
-        <w:pStyle w:val="NormalWeb"/>
-      </w:pPr>
-      <w:r>
-        <w:rPr>
-          <w:rFonts w:ascii="Segoe UI Symbol" w:hAnsi="Segoe UI Symbol" w:cs="Segoe UI Symbol"/>
-        </w:rPr>
-        <w:t>🔸</w:t>
-      </w:r>
-      <w:r>
-        <w:t xml:space="preserve"> </w:t>
-      </w:r>
-      <w:r>
-        <w:rPr>
-          <w:rStyle w:val="Strong"/>
-        </w:rPr>
-        <w:t>24. Working with APIs</w:t>
-      </w:r>
-    </w:p>
-    <w:p>
-      <w:pPr>
-        <w:pStyle w:val="NormalWeb"/>
-        <w:numPr>
-          <w:ilvl w:val="0"/>
-          <w:numId w:val="50"/>
-        </w:numPr>
-      </w:pPr>
-      <w:r>
-        <w:t>Authentication and headers</w:t>
-      </w:r>
-    </w:p>
-    <w:p>
-      <w:pPr>
-        <w:pStyle w:val="Heading3"/>
-      </w:pPr>
-      <w:r>
-        <w:rPr>
-          <w:rStyle w:val="Strong"/>
-          <w:b/>
-          <w:bCs/>
-        </w:rPr>
-        <w:t>Week 50</w:t>
-      </w:r>
-    </w:p>
-    <w:p>
-      <w:pPr>
-        <w:pStyle w:val="NormalWeb"/>
-      </w:pPr>
-      <w:r>
-        <w:rPr>
-          <w:rFonts w:ascii="Segoe UI Symbol" w:hAnsi="Segoe UI Symbol" w:cs="Segoe UI Symbol"/>
-        </w:rPr>
-        <w:t>🔸</w:t>
-      </w:r>
-      <w:r>
-        <w:t xml:space="preserve"> </w:t>
-      </w:r>
-      <w:r>
-        <w:rPr>
-          <w:rStyle w:val="Strong"/>
-        </w:rPr>
-        <w:t>25. Databases</w:t>
-      </w:r>
-    </w:p>
-    <w:p>
-      <w:pPr>
-        <w:pStyle w:val="NormalWeb"/>
-        <w:numPr>
-          <w:ilvl w:val="0"/>
-          <w:numId w:val="51"/>
-        </w:numPr>
-      </w:pPr>
-      <w:r>
-        <w:t>SQLite3 basics</w:t>
-      </w:r>
-    </w:p>
-    <w:p>
-      <w:pPr>
-        <w:pStyle w:val="NormalWeb"/>
-        <w:numPr>
-          <w:ilvl w:val="0"/>
-          <w:numId w:val="51"/>
-        </w:numPr>
-      </w:pPr>
-      <w:r>
-        <w:t>CRUD operations</w:t>
-      </w:r>
-    </w:p>
-    <w:p>
-      <w:r>
-        <w:pict>
-          <v:rect id="_x0000_i1035" style="width:0;height:1.5pt" o:hralign="center" o:hrstd="t" o:hr="t" fillcolor="#a0a0a0" stroked="f"/>
-        </w:pict>
-      </w:r>
-    </w:p>
-    <w:p>
-      <w:pPr>
-        <w:pStyle w:val="Heading2"/>
-      </w:pPr>
-      <w:r>
-        <w:rPr>
-          <w:rFonts w:ascii="Segoe UI Symbol" w:hAnsi="Segoe UI Symbol" w:cs="Segoe UI Symbol"/>
-        </w:rPr>
-        <w:t>🔴</w:t>
-      </w:r>
-      <w:r>
-        <w:t xml:space="preserve"> MONTH 13 — EXPERT LEVEL (Specialization &amp; Industry Skills)</w:t>
-      </w:r>
-    </w:p>
-    <w:p>
-      <w:pPr>
-        <w:pStyle w:val="Heading3"/>
-      </w:pPr>
-      <w:r>
-        <w:rPr>
-          <w:rStyle w:val="Strong"/>
-          <w:b/>
-          <w:bCs/>
-        </w:rPr>
-        <w:t>Week 51</w:t>
-      </w:r>
-    </w:p>
-    <w:p>
-      <w:pPr>
-        <w:pStyle w:val="NormalWeb"/>
-      </w:pPr>
-      <w:r>
-        <w:rPr>
-          <w:rFonts w:ascii="Segoe UI Symbol" w:hAnsi="Segoe UI Symbol" w:cs="Segoe UI Symbol"/>
-        </w:rPr>
-        <w:t>🔸</w:t>
-      </w:r>
-      <w:r>
-        <w:t xml:space="preserve"> </w:t>
-      </w:r>
-      <w:r>
-        <w:rPr>
-          <w:rStyle w:val="Strong"/>
-        </w:rPr>
-        <w:t>25. Databases</w:t>
-      </w:r>
-    </w:p>
-    <w:p>
-      <w:pPr>
-        <w:pStyle w:val="NormalWeb"/>
-        <w:numPr>
-          <w:ilvl w:val="0"/>
-          <w:numId w:val="52"/>
-        </w:numPr>
-      </w:pPr>
-      <w:r>
-        <w:t xml:space="preserve">Using ORMs (e.g., </w:t>
-      </w:r>
-      <w:proofErr w:type="spellStart"/>
-      <w:r>
-        <w:t>SQLAlchemy</w:t>
-      </w:r>
-      <w:proofErr w:type="spellEnd"/>
-      <w:r>
-        <w:t>)</w:t>
-      </w:r>
-    </w:p>
-    <w:p>
-      <w:pPr>
-        <w:pStyle w:val="Heading3"/>
-      </w:pPr>
-      <w:r>
-        <w:rPr>
-          <w:rStyle w:val="Strong"/>
-          <w:b/>
-          <w:bCs/>
-        </w:rPr>
-        <w:t>Week 52</w:t>
-      </w:r>
-    </w:p>
-    <w:p>
-      <w:pPr>
-        <w:pStyle w:val="NormalWeb"/>
-      </w:pPr>
-      <w:r>
-        <w:rPr>
-          <w:rFonts w:ascii="Segoe UI Symbol" w:hAnsi="Segoe UI Symbol" w:cs="Segoe UI Symbol"/>
-        </w:rPr>
-        <w:lastRenderedPageBreak/>
         <w:t>🔸</w:t>
       </w:r>
       <w:r>
@@ -10313,6 +11229,7 @@
         <w:rPr>
           <w:rFonts w:ascii="Segoe UI Symbol" w:hAnsi="Segoe UI Symbol" w:cs="Segoe UI Symbol"/>
         </w:rPr>
+        <w:lastRenderedPageBreak/>
         <w:t>🔸</w:t>
       </w:r>
       <w:r>
@@ -10334,7 +11251,6 @@
         </w:numPr>
       </w:pPr>
       <w:r>
-        <w:lastRenderedPageBreak/>
         <w:t>Versioning and publishing</w:t>
       </w:r>
     </w:p>
@@ -21086,7 +22002,7 @@
 </file>
 
 <file path=customXml/itemProps1.xml><?xml version="1.0" encoding="utf-8"?>
-<ds:datastoreItem xmlns:ds="http://schemas.openxmlformats.org/officeDocument/2006/customXml" ds:itemID="{C5C8B8C9-5F63-4E7A-94D1-15546E68FD91}">
+<ds:datastoreItem xmlns:ds="http://schemas.openxmlformats.org/officeDocument/2006/customXml" ds:itemID="{8F111119-A167-4A93-B95B-687BDE7196C6}">
   <ds:schemaRefs>
     <ds:schemaRef ds:uri="http://schemas.openxmlformats.org/officeDocument/2006/bibliography"/>
   </ds:schemaRefs>

</xml_diff>